<commit_message>
Simplify teaching page and update science license details
Focus on five teaching strengths with the official logo, direct resume downloads, Praxis report, Apps Script and classroom assessment tools. Update both one-page resume formats with the license endorsement and dates.
</commit_message>
<xml_diff>
--- a/teaching/documents/shawn-crook-cocagne-teaching-resume.docx
+++ b/teaching/documents/shawn-crook-cocagne-teaching-resume.docx
@@ -73,7 +73,23 @@
         <w:rPr>
           <w:b/>
         </w:rPr>
-        <w:t>Alternative Teaching License (ALT)</w:t>
+        <w:t>Alternative Teaching License (ALT) | Science Education (Grades 6-12)</w:t>
+      </w:r>
+    </w:p>
+    <w:p>
+      <w:pPr>
+        <w:pStyle w:val="ResumeEntry"/>
+        <w:rPr>
+          <w:i/>
+          <w:sz w:val="21"/>
+        </w:rPr>
+      </w:pPr>
+      <w:r>
+        <w:rPr>
+          <w:i/>
+          <w:sz w:val="21"/>
+        </w:rPr>
+        <w:t>Credential 24556952 | Issued July 20, 2026 | Expires July 20, 2028</w:t>
       </w:r>
     </w:p>
     <w:p>
@@ -192,7 +208,7 @@
         </w:numPr>
       </w:pPr>
       <w:r>
-        <w:t>Managed the chemical cabinet and laboratory safety; designed a QR-code usage logbook and inventory system, reorganized storage using Flinn guidance, disposed of legacy 18 M sulfuric acid following Flinn procedures, and improved containment for another acid container.</w:t>
+        <w:t>Managed chemical cabinet safety; built a QR-code inventory and logbook, reorganized storage using Flinn guidance, disposed of legacy 18 M sulfuric acid following Flinn procedures, and improved acid containment.</w:t>
       </w:r>
     </w:p>
     <w:p>
@@ -217,7 +233,7 @@
         <w:spacing w:after="100"/>
       </w:pPr>
       <w:r>
-        <w:t>Applied classroom management strategies and upheld student accommodations and requirements in Individualized Education Programs (IEPs) and Section 504 plans.</w:t>
+        <w:t>Applied classroom management strategies and implemented IEP and Section 504 requirements.</w:t>
       </w:r>
     </w:p>
     <w:p>
@@ -309,7 +325,7 @@
         <w:t>Technology:</w:t>
       </w:r>
       <w:r>
-        <w:t xml:space="preserve"> Google Workspace | Google Drive | Infinite Campus | Microsoft Office | Digital simulations | Document creation | AI competency</w:t>
+        <w:t xml:space="preserve"> Google Workspace | Google Drive | Google Apps Script | Infinite Campus | Microsoft Office | PhET | OpenStax | Document creation</w:t>
       </w:r>
     </w:p>
     <w:p>
@@ -452,7 +468,7 @@
     </w:p>
     <w:p>
       <w:pPr>
-        <w:spacing w:after="0" w:line="160" w:lineRule="exact"/>
+        <w:spacing w:after="0" w:line="20" w:lineRule="exact"/>
       </w:pPr>
     </w:p>
     <w:p>
@@ -474,13 +490,8 @@
         <w:jc w:val="center"/>
       </w:pPr>
       <w:hyperlink r:id="rId8">
-        <w:proofErr w:type="spellStart"/>
         <w:r>
-          <w:t>steadystategames.dev</w:t>
-        </w:r>
-        <w:proofErr w:type="spellEnd"/>
-        <w:r>
-          <w:t>/teaching</w:t>
+          <w:t>steadystategames.dev/teaching</w:t>
         </w:r>
       </w:hyperlink>
     </w:p>

</xml_diff>

<commit_message>
Improve teaching resume skills spacing and simplify course list
</commit_message>
<xml_diff>
--- a/teaching/documents/shawn-crook-cocagne-teaching-resume.docx
+++ b/teaching/documents/shawn-crook-cocagne-teaching-resume.docx
@@ -184,7 +184,7 @@
         <w:t>Courses:</w:t>
       </w:r>
       <w:r>
-        <w:t xml:space="preserve"> Physics, Honors Physics, Anatomy and Physiology, Chemistry, Honors Chemistry, 9th Grade Physical Science, and Circuits.</w:t>
+        <w:t xml:space="preserve"> Physics, Anatomy and Physiology, Chemistry, 9th Grade Physical Science, and Circuits.</w:t>
       </w:r>
     </w:p>
     <w:p>
@@ -302,30 +302,142 @@
     </w:p>
     <w:p>
       <w:pPr>
-        <w:spacing w:after="120" w:line="280" w:lineRule="exact"/>
+        <w:pStyle w:val="Heading1"/>
+        <w:pBdr>
+          <w:bottom w:val="single" w:sz="4" w:space="3" w:color="B0B0B0"/>
+        </w:pBdr>
+        <w:spacing w:before="0" w:after="120" w:line="260" w:lineRule="exact"/>
+        <w:rPr>
+          <w:rFonts w:eastAsiaTheme="minorEastAsia"/>
+          <w:b w:val="0"/>
+          <w:bCs w:val="0"/>
+          <w:sz w:val="22"/>
+          <w:szCs w:val="22"/>
+        </w:rPr>
       </w:pPr>
       <w:r>
         <w:rPr>
-          <w:b/>
+          <w:rFonts w:eastAsiaTheme="minorEastAsia"/>
+          <w:bCs w:val="0"/>
+          <w:sz w:val="22"/>
+          <w:szCs w:val="22"/>
         </w:rPr>
-        <w:t>Instruction:</w:t>
+        <w:t>Teaching:</w:t>
       </w:r>
       <w:r>
-        <w:t xml:space="preserve"> Individualized instruction | Asynchronous project management | Lesson planning across multiple preps | Classroom management | IEP and 504 accommodations | Digital assessment design | Laboratory safety</w:t>
+        <w:rPr>
+          <w:rFonts w:eastAsiaTheme="minorEastAsia"/>
+          <w:b w:val="0"/>
+          <w:bCs w:val="0"/>
+          <w:sz w:val="22"/>
+          <w:szCs w:val="22"/>
+        </w:rPr>
+        <w:t xml:space="preserve"> Individualized instruction, classroom management, IEP and 504 accommodations, laboratory safety.</w:t>
       </w:r>
     </w:p>
     <w:p>
       <w:pPr>
-        <w:spacing w:after="120" w:line="280" w:lineRule="exact"/>
+        <w:pStyle w:val="Heading1"/>
+        <w:pBdr>
+          <w:bottom w:val="single" w:sz="4" w:space="3" w:color="B0B0B0"/>
+        </w:pBdr>
+        <w:spacing w:before="0" w:after="120" w:line="260" w:lineRule="exact"/>
+        <w:rPr>
+          <w:rFonts w:eastAsiaTheme="minorEastAsia"/>
+          <w:b w:val="0"/>
+          <w:bCs w:val="0"/>
+          <w:sz w:val="22"/>
+          <w:szCs w:val="22"/>
+        </w:rPr>
       </w:pPr>
       <w:r>
         <w:rPr>
-          <w:b/>
+          <w:rFonts w:eastAsiaTheme="minorEastAsia"/>
+          <w:bCs w:val="0"/>
+          <w:sz w:val="22"/>
+          <w:szCs w:val="22"/>
         </w:rPr>
-        <w:t>Technology:</w:t>
+        <w:t>Planning and assessment:</w:t>
       </w:r>
       <w:r>
-        <w:t xml:space="preserve"> Google Workspace | Google Drive | Google Apps Script | Infinite Campus | Microsoft Office | PhET | OpenStax | Document creation</w:t>
+        <w:rPr>
+          <w:rFonts w:eastAsiaTheme="minorEastAsia"/>
+          <w:b w:val="0"/>
+          <w:bCs w:val="0"/>
+          <w:sz w:val="22"/>
+          <w:szCs w:val="22"/>
+        </w:rPr>
+        <w:t xml:space="preserve"> Asynchronous project management, multi-prep lesson planning, digital assessment design.</w:t>
+      </w:r>
+    </w:p>
+    <w:p>
+      <w:pPr>
+        <w:pStyle w:val="Heading1"/>
+        <w:pBdr>
+          <w:bottom w:val="single" w:sz="4" w:space="3" w:color="B0B0B0"/>
+        </w:pBdr>
+        <w:spacing w:before="0" w:after="120" w:line="260" w:lineRule="exact"/>
+        <w:rPr>
+          <w:rFonts w:eastAsiaTheme="minorEastAsia"/>
+          <w:b w:val="0"/>
+          <w:bCs w:val="0"/>
+          <w:sz w:val="22"/>
+          <w:szCs w:val="22"/>
+        </w:rPr>
+      </w:pPr>
+      <w:r>
+        <w:rPr>
+          <w:rFonts w:eastAsiaTheme="minorEastAsia"/>
+          <w:bCs w:val="0"/>
+          <w:sz w:val="22"/>
+          <w:szCs w:val="22"/>
+        </w:rPr>
+        <w:t>Productivity:</w:t>
+      </w:r>
+      <w:r>
+        <w:rPr>
+          <w:rFonts w:eastAsiaTheme="minorEastAsia"/>
+          <w:b w:val="0"/>
+          <w:bCs w:val="0"/>
+          <w:sz w:val="22"/>
+          <w:szCs w:val="22"/>
+        </w:rPr>
+        <w:t xml:space="preserve"> Google Workspace, Google Drive, Google Apps Script, Microsoft Office, document creation.</w:t>
+      </w:r>
+    </w:p>
+    <w:p>
+      <w:pPr>
+        <w:pStyle w:val="Heading1"/>
+        <w:pBdr>
+          <w:bottom w:val="single" w:sz="4" w:space="3" w:color="B0B0B0"/>
+        </w:pBdr>
+        <w:spacing w:before="0" w:after="120" w:line="260" w:lineRule="exact"/>
+        <w:rPr>
+          <w:rFonts w:eastAsiaTheme="minorEastAsia"/>
+          <w:b w:val="0"/>
+          <w:bCs w:val="0"/>
+          <w:sz w:val="22"/>
+          <w:szCs w:val="22"/>
+        </w:rPr>
+      </w:pPr>
+      <w:r>
+        <w:rPr>
+          <w:rFonts w:eastAsiaTheme="minorEastAsia"/>
+          <w:bCs w:val="0"/>
+          <w:sz w:val="22"/>
+          <w:szCs w:val="22"/>
+        </w:rPr>
+        <w:t>Learning resources:</w:t>
+      </w:r>
+      <w:r>
+        <w:rPr>
+          <w:rFonts w:eastAsiaTheme="minorEastAsia"/>
+          <w:b w:val="0"/>
+          <w:bCs w:val="0"/>
+          <w:sz w:val="22"/>
+          <w:szCs w:val="22"/>
+        </w:rPr>
+        <w:t xml:space="preserve"> Infinite Campus, PhET, OpenStax.</w:t>
       </w:r>
     </w:p>
     <w:p>

</xml_diff>

<commit_message>
Sync teaching resume downloads with latest Word edits
</commit_message>
<xml_diff>
--- a/teaching/documents/shawn-crook-cocagne-teaching-resume.docx
+++ b/teaching/documents/shawn-crook-cocagne-teaching-resume.docx
@@ -332,7 +332,47 @@
           <w:sz w:val="22"/>
           <w:szCs w:val="22"/>
         </w:rPr>
-        <w:t xml:space="preserve"> Individualized instruction, classroom management, IEP and 504 accommodations, laboratory safety.</w:t>
+        <w:t xml:space="preserve"> </w:t>
+      </w:r>
+      <w:r>
+        <w:rPr>
+          <w:rFonts w:eastAsiaTheme="minorEastAsia"/>
+          <w:b w:val="0"/>
+          <w:bCs w:val="0"/>
+          <w:sz w:val="22"/>
+          <w:szCs w:val="22"/>
+        </w:rPr>
+        <w:t>1 on 1 tutoring</w:t>
+      </w:r>
+      <w:r>
+        <w:rPr>
+          <w:rFonts w:eastAsiaTheme="minorEastAsia"/>
+          <w:b w:val="0"/>
+          <w:bCs w:val="0"/>
+          <w:sz w:val="22"/>
+          <w:szCs w:val="22"/>
+        </w:rPr>
+        <w:t xml:space="preserve">, </w:t>
+      </w:r>
+      <w:r>
+        <w:rPr>
+          <w:rFonts w:eastAsiaTheme="minorEastAsia"/>
+          <w:b w:val="0"/>
+          <w:bCs w:val="0"/>
+          <w:sz w:val="22"/>
+          <w:szCs w:val="22"/>
+        </w:rPr>
+        <w:t>finding alternatives strategies,</w:t>
+      </w:r>
+      <w:r>
+        <w:rPr>
+          <w:rFonts w:eastAsiaTheme="minorEastAsia"/>
+          <w:b w:val="0"/>
+          <w:bCs w:val="0"/>
+          <w:sz w:val="22"/>
+          <w:szCs w:val="22"/>
+        </w:rPr>
+        <w:t xml:space="preserve"> IEP and 504 accommodations, laboratory safety.</w:t>
       </w:r>
     </w:p>
     <w:p>
@@ -367,7 +407,47 @@
           <w:sz w:val="22"/>
           <w:szCs w:val="22"/>
         </w:rPr>
-        <w:t xml:space="preserve"> Asynchronous project management, multi-prep lesson planning, digital assessment design.</w:t>
+        <w:t xml:space="preserve"> Asynchronous project management</w:t>
+      </w:r>
+      <w:r>
+        <w:rPr>
+          <w:rFonts w:eastAsiaTheme="minorEastAsia"/>
+          <w:b w:val="0"/>
+          <w:bCs w:val="0"/>
+          <w:sz w:val="22"/>
+          <w:szCs w:val="22"/>
+        </w:rPr>
+        <w:t>,</w:t>
+      </w:r>
+      <w:r>
+        <w:rPr>
+          <w:rFonts w:eastAsiaTheme="minorEastAsia"/>
+          <w:b w:val="0"/>
+          <w:bCs w:val="0"/>
+          <w:sz w:val="22"/>
+          <w:szCs w:val="22"/>
+        </w:rPr>
+        <w:t xml:space="preserve"> </w:t>
+      </w:r>
+      <w:r>
+        <w:rPr>
+          <w:rFonts w:eastAsiaTheme="minorEastAsia"/>
+          <w:b w:val="0"/>
+          <w:bCs w:val="0"/>
+          <w:sz w:val="22"/>
+          <w:szCs w:val="22"/>
+        </w:rPr>
+        <w:t>slideshow creation</w:t>
+      </w:r>
+      <w:r>
+        <w:rPr>
+          <w:rFonts w:eastAsiaTheme="minorEastAsia"/>
+          <w:b w:val="0"/>
+          <w:bCs w:val="0"/>
+          <w:sz w:val="22"/>
+          <w:szCs w:val="22"/>
+        </w:rPr>
+        <w:t>, digital assessment design.</w:t>
       </w:r>
     </w:p>
     <w:p>
@@ -402,7 +482,27 @@
           <w:sz w:val="22"/>
           <w:szCs w:val="22"/>
         </w:rPr>
-        <w:t xml:space="preserve"> Google Workspace, Google Drive, Google Apps Script, Microsoft Office, document creation.</w:t>
+        <w:t xml:space="preserve"> Google Workspace, Google Drive, Google Apps Script, Microsoft Office</w:t>
+      </w:r>
+      <w:r>
+        <w:rPr>
+          <w:rFonts w:eastAsiaTheme="minorEastAsia"/>
+          <w:b w:val="0"/>
+          <w:bCs w:val="0"/>
+          <w:sz w:val="22"/>
+          <w:szCs w:val="22"/>
+        </w:rPr>
+        <w:t>, Google Calendar</w:t>
+      </w:r>
+      <w:r>
+        <w:rPr>
+          <w:rFonts w:eastAsiaTheme="minorEastAsia"/>
+          <w:b w:val="0"/>
+          <w:bCs w:val="0"/>
+          <w:sz w:val="22"/>
+          <w:szCs w:val="22"/>
+        </w:rPr>
+        <w:t>, AI.</w:t>
       </w:r>
     </w:p>
     <w:p>
@@ -427,7 +527,25 @@
           <w:sz w:val="22"/>
           <w:szCs w:val="22"/>
         </w:rPr>
-        <w:t>Learning resources:</w:t>
+        <w:t xml:space="preserve">Learning </w:t>
+      </w:r>
+      <w:r>
+        <w:rPr>
+          <w:rFonts w:eastAsiaTheme="minorEastAsia"/>
+          <w:bCs w:val="0"/>
+          <w:sz w:val="22"/>
+          <w:szCs w:val="22"/>
+        </w:rPr>
+        <w:t>R</w:t>
+      </w:r>
+      <w:r>
+        <w:rPr>
+          <w:rFonts w:eastAsiaTheme="minorEastAsia"/>
+          <w:bCs w:val="0"/>
+          <w:sz w:val="22"/>
+          <w:szCs w:val="22"/>
+        </w:rPr>
+        <w:t>esources:</w:t>
       </w:r>
       <w:r>
         <w:rPr>
@@ -437,7 +555,37 @@
           <w:sz w:val="22"/>
           <w:szCs w:val="22"/>
         </w:rPr>
-        <w:t xml:space="preserve"> Infinite Campus, PhET, OpenStax.</w:t>
+        <w:t xml:space="preserve"> Infinite Campus,</w:t>
+      </w:r>
+      <w:r>
+        <w:rPr>
+          <w:rFonts w:eastAsiaTheme="minorEastAsia"/>
+          <w:b w:val="0"/>
+          <w:bCs w:val="0"/>
+          <w:sz w:val="22"/>
+          <w:szCs w:val="22"/>
+        </w:rPr>
+        <w:t xml:space="preserve"> Canvas, </w:t>
+      </w:r>
+      <w:r>
+        <w:rPr>
+          <w:rFonts w:eastAsiaTheme="minorEastAsia"/>
+          <w:b w:val="0"/>
+          <w:bCs w:val="0"/>
+          <w:sz w:val="22"/>
+          <w:szCs w:val="22"/>
+        </w:rPr>
+        <w:t>PhET, OpenStax</w:t>
+      </w:r>
+      <w:r>
+        <w:rPr>
+          <w:rFonts w:eastAsiaTheme="minorEastAsia"/>
+          <w:b w:val="0"/>
+          <w:bCs w:val="0"/>
+          <w:sz w:val="22"/>
+          <w:szCs w:val="22"/>
+        </w:rPr>
+        <w:t>, and more.</w:t>
       </w:r>
     </w:p>
     <w:p>

</xml_diff>

<commit_message>
Correct teaching resume grammar and typography before application
</commit_message>
<xml_diff>
--- a/teaching/documents/shawn-crook-cocagne-teaching-resume.docx
+++ b/teaching/documents/shawn-crook-cocagne-teaching-resume.docx
@@ -286,7 +286,13 @@
         <w:t>Additional credential:</w:t>
       </w:r>
       <w:r>
-        <w:t xml:space="preserve"> Engineer In Training (FE Chemical), June 2024.</w:t>
+        <w:t xml:space="preserve"> </w:t>
+      </w:r>
+      <w:r>
+        <w:t>Engineer in Training</w:t>
+      </w:r>
+      <w:r>
+        <w:t xml:space="preserve"> (FE Chemical), June 2024.</w:t>
       </w:r>
     </w:p>
     <w:p>
@@ -342,7 +348,7 @@
           <w:sz w:val="22"/>
           <w:szCs w:val="22"/>
         </w:rPr>
-        <w:t>1 on 1 tutoring</w:t>
+        <w:t>one-on-one tutoring</w:t>
       </w:r>
       <w:r>
         <w:rPr>
@@ -362,7 +368,17 @@
           <w:sz w:val="22"/>
           <w:szCs w:val="22"/>
         </w:rPr>
-        <w:t>finding alternatives strategies,</w:t>
+        <w:t>finding alternative strategies</w:t>
+      </w:r>
+      <w:r>
+        <w:rPr>
+          <w:rFonts w:eastAsiaTheme="minorEastAsia"/>
+          <w:b w:val="0"/>
+          <w:bCs w:val="0"/>
+          <w:sz w:val="22"/>
+          <w:szCs w:val="22"/>
+        </w:rPr>
+        <w:t>,</w:t>
       </w:r>
       <w:r>
         <w:rPr>
@@ -527,25 +543,7 @@
           <w:sz w:val="22"/>
           <w:szCs w:val="22"/>
         </w:rPr>
-        <w:t xml:space="preserve">Learning </w:t>
-      </w:r>
-      <w:r>
-        <w:rPr>
-          <w:rFonts w:eastAsiaTheme="minorEastAsia"/>
-          <w:bCs w:val="0"/>
-          <w:sz w:val="22"/>
-          <w:szCs w:val="22"/>
-        </w:rPr>
-        <w:t>R</w:t>
-      </w:r>
-      <w:r>
-        <w:rPr>
-          <w:rFonts w:eastAsiaTheme="minorEastAsia"/>
-          <w:bCs w:val="0"/>
-          <w:sz w:val="22"/>
-          <w:szCs w:val="22"/>
-        </w:rPr>
-        <w:t>esources:</w:t>
+        <w:t>Learning resources:</w:t>
       </w:r>
       <w:r>
         <w:rPr>
@@ -710,7 +708,7 @@
         <w:rPr>
           <w:i/>
         </w:rPr>
-        <w:t>Peer Assisted Learning Lab Tutor</w:t>
+        <w:t>Peer-Assisted Learning Lab Tutor</w:t>
       </w:r>
     </w:p>
     <w:p>

</xml_diff>